<commit_message>
Registra CI aprobada y cierra el informe QA del profesor
</commit_message>
<xml_diff>
--- a/docs/entrega_2/03_Informe_de_pruebas_QA.docx
+++ b/docs/entrega_2/03_Informe_de_pruebas_QA.docx
@@ -3512,6 +3512,192 @@
           </w:p>
         </w:tc>
       </w:tr>
+      <w:tr>
+        <w:tblPrEx>
+          <w:tblCellMar>
+            <w:top w:w="0" w:type="dxa"/>
+            <w:bottom w:w="0" w:type="dxa"/>
+          </w:tblCellMar>
+        </w:tblPrEx>
+        <w:trPr>
+          <w:cantSplit/>
+          <w:trHeight w:val="440"/>
+        </w:trPr>
+        <w:tc>
+          <w:tcPr>
+            <w:tcW w:w="1013" w:type="dxa"/>
+            <w:tcBorders>
+              <w:top w:val="single" w:sz="4" w:space="0" w:color="BFBFBF"/>
+              <w:left w:val="single" w:sz="4" w:space="0" w:color="BFBFBF"/>
+              <w:bottom w:val="single" w:sz="4" w:space="0" w:color="BFBFBF"/>
+              <w:right w:val="single" w:sz="4" w:space="0" w:color="BFBFBF"/>
+            </w:tcBorders>
+            <w:tcMar>
+              <w:top w:w="70" w:type="dxa"/>
+              <w:left w:w="100" w:type="dxa"/>
+              <w:bottom w:w="70" w:type="dxa"/>
+              <w:right w:w="100" w:type="dxa"/>
+            </w:tcMar>
+            <w:vAlign w:val="center"/>
+          </w:tcPr>
+          <w:p>
+            <w:r>
+              <w:rPr>
+                <w:b w:val="0"/>
+                <w:i w:val="0"/>
+                <w:color w:val="222222"/>
+                <w:sz w:val="19"/>
+              </w:rPr>
+              <w:t>ER-05 CI</w:t>
+            </w:r>
+          </w:p>
+        </w:tc>
+        <w:tc>
+          <w:tcPr>
+            <w:tcW w:w="3800" w:type="dxa"/>
+            <w:tcBorders>
+              <w:top w:val="single" w:sz="4" w:space="0" w:color="BFBFBF"/>
+              <w:left w:val="single" w:sz="4" w:space="0" w:color="BFBFBF"/>
+              <w:bottom w:val="single" w:sz="4" w:space="0" w:color="BFBFBF"/>
+              <w:right w:val="single" w:sz="4" w:space="0" w:color="BFBFBF"/>
+            </w:tcBorders>
+            <w:tcMar>
+              <w:top w:w="70" w:type="dxa"/>
+              <w:left w:w="100" w:type="dxa"/>
+              <w:bottom w:w="70" w:type="dxa"/>
+              <w:right w:w="100" w:type="dxa"/>
+            </w:tcMar>
+            <w:vAlign w:val="center"/>
+          </w:tcPr>
+          <w:p>
+            <w:r>
+              <w:rPr>
+                <w:b w:val="0"/>
+                <w:i w:val="0"/>
+                <w:color w:val="222222"/>
+                <w:sz w:val="19"/>
+              </w:rPr>
+              <w:t>Aserción de test_desktop.py comparaba ruta larga con alias temporal 8.3; CI inicial falló.</w:t>
+            </w:r>
+          </w:p>
+        </w:tc>
+        <w:tc>
+          <w:tcPr>
+            <w:tcW w:w="1773" w:type="dxa"/>
+            <w:tcBorders>
+              <w:top w:val="single" w:sz="4" w:space="0" w:color="BFBFBF"/>
+              <w:left w:val="single" w:sz="4" w:space="0" w:color="BFBFBF"/>
+              <w:bottom w:val="single" w:sz="4" w:space="0" w:color="BFBFBF"/>
+              <w:right w:val="single" w:sz="4" w:space="0" w:color="BFBFBF"/>
+            </w:tcBorders>
+            <w:tcMar>
+              <w:top w:w="70" w:type="dxa"/>
+              <w:left w:w="100" w:type="dxa"/>
+              <w:bottom w:w="70" w:type="dxa"/>
+              <w:right w:w="100" w:type="dxa"/>
+            </w:tcMar>
+            <w:vAlign w:val="center"/>
+          </w:tcPr>
+          <w:p>
+            <w:r>
+              <w:rPr>
+                <w:b w:val="0"/>
+                <w:i w:val="0"/>
+                <w:color w:val="222222"/>
+                <w:sz w:val="19"/>
+              </w:rPr>
+              <w:t>CP-10</w:t>
+            </w:r>
+          </w:p>
+        </w:tc>
+        <w:tc>
+          <w:tcPr>
+            <w:tcW w:w="1520" w:type="dxa"/>
+            <w:tcBorders>
+              <w:top w:val="single" w:sz="4" w:space="0" w:color="BFBFBF"/>
+              <w:left w:val="single" w:sz="4" w:space="0" w:color="BFBFBF"/>
+              <w:bottom w:val="single" w:sz="4" w:space="0" w:color="BFBFBF"/>
+              <w:right w:val="single" w:sz="4" w:space="0" w:color="BFBFBF"/>
+            </w:tcBorders>
+            <w:tcMar>
+              <w:top w:w="70" w:type="dxa"/>
+              <w:left w:w="100" w:type="dxa"/>
+              <w:bottom w:w="70" w:type="dxa"/>
+              <w:right w:w="100" w:type="dxa"/>
+            </w:tcMar>
+            <w:vAlign w:val="center"/>
+          </w:tcPr>
+          <w:p>
+            <w:r>
+              <w:rPr>
+                <w:b w:val="0"/>
+                <w:i w:val="0"/>
+                <w:color w:val="222222"/>
+                <w:sz w:val="19"/>
+              </w:rPr>
+              <w:t>Baja</w:t>
+            </w:r>
+          </w:p>
+        </w:tc>
+        <w:tc>
+          <w:tcPr>
+            <w:tcW w:w="3800" w:type="dxa"/>
+            <w:tcBorders>
+              <w:top w:val="single" w:sz="4" w:space="0" w:color="BFBFBF"/>
+              <w:left w:val="single" w:sz="4" w:space="0" w:color="BFBFBF"/>
+              <w:bottom w:val="single" w:sz="4" w:space="0" w:color="BFBFBF"/>
+              <w:right w:val="single" w:sz="4" w:space="0" w:color="BFBFBF"/>
+            </w:tcBorders>
+            <w:tcMar>
+              <w:top w:w="70" w:type="dxa"/>
+              <w:left w:w="100" w:type="dxa"/>
+              <w:bottom w:w="70" w:type="dxa"/>
+              <w:right w:w="100" w:type="dxa"/>
+            </w:tcMar>
+            <w:vAlign w:val="center"/>
+          </w:tcPr>
+          <w:p>
+            <w:r>
+              <w:rPr>
+                <w:b w:val="0"/>
+                <w:i w:val="0"/>
+                <w:color w:val="222222"/>
+                <w:sz w:val="19"/>
+              </w:rPr>
+              <w:t>Resolver ambos lados con Path.resolve(); mantener aislamiento y limpieza. Sin cambios en app o binarios.</w:t>
+            </w:r>
+          </w:p>
+        </w:tc>
+        <w:tc>
+          <w:tcPr>
+            <w:tcW w:w="1774" w:type="dxa"/>
+            <w:tcBorders>
+              <w:top w:val="single" w:sz="4" w:space="0" w:color="BFBFBF"/>
+              <w:left w:val="single" w:sz="4" w:space="0" w:color="BFBFBF"/>
+              <w:bottom w:val="single" w:sz="4" w:space="0" w:color="BFBFBF"/>
+              <w:right w:val="single" w:sz="4" w:space="0" w:color="BFBFBF"/>
+            </w:tcBorders>
+            <w:tcMar>
+              <w:top w:w="70" w:type="dxa"/>
+              <w:left w:w="100" w:type="dxa"/>
+              <w:bottom w:w="70" w:type="dxa"/>
+              <w:right w:w="100" w:type="dxa"/>
+            </w:tcMar>
+            <w:vAlign w:val="center"/>
+          </w:tcPr>
+          <w:p>
+            <w:r>
+              <w:rPr>
+                <w:b w:val="0"/>
+                <w:i w:val="0"/>
+                <w:color w:val="222222"/>
+                <w:sz w:val="19"/>
+              </w:rPr>
+              <w:t>6/6 local; CI 4/4 en c8d6942</w:t>
+            </w:r>
+          </w:p>
+        </w:tc>
+      </w:tr>
     </w:tbl>
     <w:p>
       <w:pPr>
@@ -3752,7 +3938,7 @@
               </w:rPr>
               <w:t>10 casos de matriz</w:t>
               <w:br/>
-              <w:t>157 pruebas auto</w:t>
+              <w:t>157 pruebas auto locales</w:t>
             </w:r>
           </w:p>
         </w:tc>
@@ -3783,7 +3969,7 @@
               </w:rPr>
               <w:t>10 casos revalidados</w:t>
               <w:br/>
-              <w:t>150 pruebas auto</w:t>
+              <w:t>150 pruebas auto locales</w:t>
             </w:r>
           </w:p>
         </w:tc>
@@ -3812,7 +3998,9 @@
                 <w:color w:val="222222"/>
                 <w:sz w:val="19"/>
               </w:rPr>
-              <w:t>0 en suite</w:t>
+              <w:t>0 en suite local</w:t>
+              <w:br/>
+              <w:t>CI inicial: 1 aserción</w:t>
             </w:r>
           </w:p>
         </w:tc>
@@ -3842,6 +4030,8 @@
                 <w:sz w:val="19"/>
               </w:rPr>
               <w:t>4 revalidados</w:t>
+              <w:br/>
+              <w:t>1 ajuste de prueba CI</w:t>
             </w:r>
           </w:p>
         </w:tc>
@@ -3870,9 +4060,9 @@
                 <w:color w:val="222222"/>
                 <w:sz w:val="19"/>
               </w:rPr>
-              <w:t>0 defectos de software</w:t>
+              <w:t>CI c8d6942: 4/4</w:t>
               <w:br/>
-              <w:t>Ver límites en conclusiones</w:t>
+              <w:t>Límites en conclusiones</w:t>
             </w:r>
           </w:p>
         </w:tc>
@@ -3955,7 +4145,25 @@
                 <w:sz w:val="20"/>
                 <w:szCs w:val="19"/>
               </w:rPr>
-              <w:t>La suite ejecutó 157 pruebas: 150 aprobadas, 7 omitidas por requerir MySQL opt-in y 0 fallidas. Las omisiones no se cuentan como aprobación. Los nueve casos de software del informe de Víctor quedan trazados a la suite actual; el caso de paquete distingue la evidencia histórica de instalación de la nueva verificación del ejecutable.</w:t>
+              <w:t>La suite local ejecutó 157 pruebas: 150 aprobadas, 7 omitidas por requerir MySQL opt-in y 0 fallidas. Las omisiones no se cuentan como aprobación. Los nueve casos de software del informe de Víctor quedan trazados a la suite actual; el caso de paquete distingue la evidencia histórica de instalación de la nueva verificación del ejecutable.</w:t>
+            </w:r>
+          </w:p>
+          <w:p>
+            <w:pPr>
+              <w:keepLines/>
+              <w:spacing w:before="60" w:after="100"/>
+              <w:jc w:val="left"/>
+            </w:pPr>
+            <w:r>
+              <w:rPr>
+                <w:b w:val="0"/>
+                <w:i w:val="0"/>
+                <w:iCs/>
+                <w:color w:val="222222"/>
+                <w:sz w:val="20"/>
+                <w:szCs w:val="19"/>
+              </w:rPr>
+              <w:t>La ejecución inicial de GitHub Actions falló en una aserción de aislamiento: Windows entregó un directorio temporal con alias corto 8.3 y la prueba lo comparó con su ruta larga. El ajuste sólo normaliza ambos lados con resolve(); las seis pruebas de test_desktop.py aprobaron localmente con alias 8.3 real y con el entorno habitual. CI del commit c8d6942 aprobó cuatro checks de Windows y Linux con MySQL en push y PR: https://github.com/a3524110303-cpu/M.E.S.S.I-/actions/runs/37753609896 y https://github.com/a3524110303-cpu/M.E.S.S.I-/actions/runs/37753615435. Este resultado corresponde a c8d6942, anterior a esta actualización documental. Causa y reproducción en docs/entrega_2/evidencias/ajuste_ci_windows.md; no se modificaron la aplicación ni sus binarios.</w:t>
             </w:r>
           </w:p>
           <w:p>

</xml_diff>